<commit_message>
Add damages claim schedule; expand October 2025 exclusion period
Adds a per-occurrence damages worksheet (MCL 600.2918: $200 or treble
actual damages per occurrence) covering 23 lockout/exclusion events and
5 property-removal events, and expands the timeline's October 2025
section into the month-long displacement (rented room, then camper)
that followed the Sep 30 padlocking, utility shutoff, and belongings
removal.

Co-Authored-By: Claude Fable 5 <noreply@anthropic.com>
Claude-Session: https://claude.ai/code/session_01Eu24oXvBANddupQVtz6ytZ
</commit_message>
<xml_diff>
--- a/docs/evidence/Lockout_and_Property_Removal_Timeline.docx
+++ b/docs/evidence/Lockout_and_Property_Removal_Timeline.docx
@@ -2835,7 +2835,7 @@
         <w:spacing w:after="40" w:before="280"/>
       </w:pPr>
       <w:r>
-        <w:t xml:space="preserve">October–November 2025 — Quieter period; displacement references</w:t>
+        <w:t xml:space="preserve">October 2025 — MONTH-LONG EXCLUSION: displaced after the Sep 30 padlock, utility shutoff, and belongings removal; Tom lives in a rented room, then a camper</w:t>
       </w:r>
     </w:p>
     <w:p>
@@ -2850,7 +2850,85 @@
           <w:sz w:val="20"/>
           <w:szCs w:val="20"/>
         </w:rPr>
-        <w:t xml:space="preserve">Categories: ACCESS</w:t>
+        <w:t xml:space="preserve">Categories: LOCKOUT / PROPERTY / ACCESS</w:t>
+      </w:r>
+    </w:p>
+    <w:p>
+      <w:pPr>
+        <w:spacing w:after="20"/>
+      </w:pPr>
+      <w:r>
+        <w:rPr>
+          <w:b/>
+          <w:bCs/>
+        </w:rPr>
+        <w:t xml:space="preserve">[Sep 30 – Oct 2025] </w:t>
+      </w:r>
+      <w:r>
+        <w:rPr>
+          <w:b/>
+          <w:bCs/>
+          <w:color w:val="1F4E79"/>
+        </w:rPr>
+        <w:t xml:space="preserve">—: </w:t>
+      </w:r>
+      <w:r>
+        <w:t xml:space="preserve">“(Period summary) Following the September 30 padlocking/boarding of the door, the announced utility shutoff ('the power water. Everything is getting shut off'), and the October 1 discovery of Tom's belongings at the side of the road, the message log goes largely quiet on the residence for the month of October — consistent with Tom being out of the home for the entire month.”</w:t>
+      </w:r>
+    </w:p>
+    <w:p>
+      <w:pPr>
+        <w:spacing w:after="140"/>
+        <w:ind w:left="360"/>
+      </w:pPr>
+      <w:r>
+        <w:rPr>
+          <w:i/>
+          <w:iCs/>
+          <w:color w:val="555555"/>
+          <w:sz w:val="20"/>
+          <w:szCs w:val="20"/>
+        </w:rPr>
+        <w:t xml:space="preserve">The displacement is corroborated by the entries below.</w:t>
+      </w:r>
+    </w:p>
+    <w:p>
+      <w:pPr>
+        <w:spacing w:after="20"/>
+      </w:pPr>
+      <w:r>
+        <w:rPr>
+          <w:b/>
+          <w:bCs/>
+        </w:rPr>
+        <w:t xml:space="preserve">[Oct 1, 2025 3:53 AM] </w:t>
+      </w:r>
+      <w:r>
+        <w:rPr>
+          <w:b/>
+          <w:bCs/>
+          <w:color w:val="1F4E79"/>
+        </w:rPr>
+        <w:t xml:space="preserve">TOM: </w:t>
+      </w:r>
+      <w:r>
+        <w:t xml:space="preserve">“Excuse me, I moved nothing out, I went and got a room with my dogs...”</w:t>
+      </w:r>
+    </w:p>
+    <w:p>
+      <w:pPr>
+        <w:spacing w:after="140"/>
+        <w:ind w:left="360"/>
+      </w:pPr>
+      <w:r>
+        <w:rPr>
+          <w:i/>
+          <w:iCs/>
+          <w:color w:val="555555"/>
+          <w:sz w:val="20"/>
+          <w:szCs w:val="20"/>
+        </w:rPr>
+        <w:t xml:space="preserve">Tom paying for lodging elsewhere on the first night of the exclusion period.</w:t>
       </w:r>
     </w:p>
     <w:p>
@@ -2889,7 +2967,7 @@
           <w:sz w:val="20"/>
           <w:szCs w:val="20"/>
         </w:rPr>
-        <w:t xml:space="preserve">Tom attributes his displacement from the home to David.</w:t>
+        <w:t xml:space="preserve">One month later: Tom states he has been living in a camper because of David — covering the month of October 2025.</w:t>
       </w:r>
     </w:p>
     <w:p>
@@ -2928,7 +3006,7 @@
           <w:sz w:val="20"/>
           <w:szCs w:val="20"/>
         </w:rPr>
-        <w:t xml:space="preserve">Tom's return treated as conditional on David's say-so.</w:t>
+        <w:t xml:space="preserve">Even after returning, Tom's presence is treated as conditional on David's say-so.</w:t>
       </w:r>
     </w:p>
     <w:p>

</xml_diff>

<commit_message>
Log Jul 21 router/internet disconnection incident as addendum
Adds a dated addendum entry (reported after the Jul 18 export cutoff):
router unplugged / internet disconnected during live automated forex
trading, continuing the documented service-interference pattern.

Co-Authored-By: Claude Fable 5 <noreply@anthropic.com>
Claude-Session: https://claude.ai/code/session_01Eu24oXvBANddupQVtz6ytZ
</commit_message>
<xml_diff>
--- a/docs/evidence/Lockout_and_Property_Removal_Timeline.docx
+++ b/docs/evidence/Lockout_and_Property_Removal_Timeline.docx
@@ -7901,6 +7901,69 @@
     </w:p>
     <w:p>
       <w:pPr>
+        <w:pStyle w:val="Heading2"/>
+        <w:spacing w:after="40" w:before="280"/>
+      </w:pPr>
+      <w:r>
+        <w:t xml:space="preserve">Addendum — incidents after the July 18, 2026 export cutoff</w:t>
+      </w:r>
+    </w:p>
+    <w:p>
+      <w:pPr>
+        <w:spacing w:after="120"/>
+      </w:pPr>
+      <w:r>
+        <w:rPr>
+          <w:b/>
+          <w:bCs/>
+          <w:color w:val="555555"/>
+          <w:sz w:val="20"/>
+          <w:szCs w:val="20"/>
+        </w:rPr>
+        <w:t xml:space="preserve">Categories: ACCESS (service interference)</w:t>
+      </w:r>
+    </w:p>
+    <w:p>
+      <w:pPr>
+        <w:spacing w:after="20"/>
+      </w:pPr>
+      <w:r>
+        <w:rPr>
+          <w:b/>
+          <w:bCs/>
+        </w:rPr>
+        <w:t xml:space="preserve">[Jul 21, 2026] </w:t>
+      </w:r>
+      <w:r>
+        <w:rPr>
+          <w:b/>
+          <w:bCs/>
+          <w:color w:val="1F4E79"/>
+        </w:rPr>
+        <w:t xml:space="preserve">—: </w:t>
+      </w:r>
+      <w:r>
+        <w:t xml:space="preserve">“(Reported by Thomas Bateman Jr., July 21, 2026 — occurred after the SMS export was generated.) David unplugged Tom's router / disconnected the internet connection while Tom was running automated trading with real money on the forex exchange, leaving live trades unmanaged and exposing Tom to immediate financial loss.”</w:t>
+      </w:r>
+    </w:p>
+    <w:p>
+      <w:pPr>
+        <w:spacing w:after="140"/>
+        <w:ind w:left="360"/>
+      </w:pPr>
+      <w:r>
+        <w:rPr>
+          <w:i/>
+          <w:iCs/>
+          <w:color w:val="555555"/>
+          <w:sz w:val="20"/>
+          <w:szCs w:val="20"/>
+        </w:rPr>
+        <w:t xml:space="preserve">Continues the internet/service-interference pattern already documented in the SMS record (wifi cutoffs and password withholding: Aug–Sep 2025; Feb 17–18, Feb 25, Mar 1–4, Mar 31, Apr 5–6, 2026). Any trading losses from these disconnections should be documented (timestamps, account statements) and added to Schedule C of the damages claim schedule.</w:t>
+      </w:r>
+    </w:p>
+    <w:p>
+      <w:pPr>
         <w:pStyle w:val="Heading1"/>
         <w:pageBreakBefore/>
       </w:pPr>

</xml_diff>